<commit_message>
Parameterize the vendor name in the statement of account template
The template carried "SV KICKz" in six places and a footwear tagline, so
every vendor's statement announced one particular vendor's name and trade.
Both are now a {{ vendor_name }} placeholder or gone.

The signature cell reads "Vendor Representative" rather than a placeholder
on purpose: the server's renderer walks doc.paragraphs only and never
descends into table cells, so a placeholder there would be exported
literally. It also mirrors "Venue Representative" opposite it.

Co-Authored-By: Claude Opus 5 <noreply@anthropic.com>
</commit_message>
<xml_diff>
--- a/statement_of_account_template.docx
+++ b/statement_of_account_template.docx
@@ -16,22 +16,7 @@
           <w:sz w:val="34"/>
           <w:spacing w:val="6"/>
         </w:rPr>
-        <w:t>SV KICKz</w:t>
-      </w:r>
-    </w:p>
-    <w:p>
-      <w:pPr>
-        <w:spacing w:before="0" w:after="40"/>
-      </w:pPr>
-      <w:r>
-        <w:rPr>
-          <w:rFonts w:ascii="Calibri" w:hAnsi="Calibri"/>
-          <w:b w:val="0"/>
-          <w:i/>
-          <w:color w:val="595959"/>
-          <w:sz w:val="18"/>
-        </w:rPr>
-        <w:t>Pop-up Bazaar Footwear</w:t>
+        <w:t>{{ vendor_name }}</w:t>
       </w:r>
     </w:p>
     <w:p>
@@ -120,7 +105,7 @@
           <w:color w:val="595959"/>
           <w:sz w:val="19"/>
         </w:rPr>
-        <w:t>SV KICKz collects all sales at the bazaar. This statement shows the gross sales recorded and the venue's share of that amount.</w:t>
+        <w:t>{{ vendor_name }} collects all sales at the bazaar. This statement shows the gross sales recorded and the venue's share of that amount.</w:t>
       </w:r>
     </w:p>
     <w:p>
@@ -290,7 +275,7 @@
           <w:color w:val="595959"/>
           <w:sz w:val="20"/>
         </w:rPr>
-        <w:t>Retained by SV KICKz</w:t>
+        <w:t>Retained by {{ vendor_name }}</w:t>
       </w:r>
       <w:r>
         <w:tab/>
@@ -318,7 +303,7 @@
           <w:color w:val="595959"/>
           <w:sz w:val="18"/>
         </w:rPr>
-        <w:t>SV KICKz collected the gross sales above and will remit the venue share to the venue.</w:t>
+        <w:t>{{ vendor_name }} collected the gross sales above and will remit the venue share to the venue.</w:t>
       </w:r>
     </w:p>
     <w:tbl>
@@ -391,7 +376,7 @@
                 <w:color w:val="595959"/>
                 <w:sz w:val="17"/>
               </w:rPr>
-              <w:t>SV KICKz Representative</w:t>
+              <w:t>Vendor Representative</w:t>
             </w:r>
           </w:p>
           <w:p>
@@ -526,7 +511,7 @@
           <w:color w:val="595959"/>
           <w:sz w:val="16"/>
         </w:rPr>
-        <w:t>SV KICKz — this statement is generated per bazaar event and reflects the agreed revenue-share terms between SV KICKz and the venue.</w:t>
+        <w:t>{{ vendor_name }} — this statement is generated per bazaar event and reflects the agreed revenue-share terms between {{ vendor_name }} and the venue.</w:t>
       </w:r>
     </w:p>
     <w:sectPr>

</xml_diff>